<commit_message>
Nagra: indent the 'a cry from some of myself' lines, no quotation marks
Co-Authored-By: Claude Sonnet 5.5 <noreply@anthropic.com>
</commit_message>
<xml_diff>
--- a/content-src/docx/R LRB 2007 06 21 Daljit Nagra.docx
+++ b/content-src/docx/R LRB 2007 06 21 Daljit Nagra.docx
@@ -530,35 +530,45 @@
         <w:t>In Heaney’s ‘Digging’, the poet takes up his pen as his rural forefathers took up spade and hoe. In Nagra’s ‘Digging’, the narrator’s sense of not being rooted in any culture – neither rose nor cardamom – leads him to dig, not into Heaney’s fertile ancestral soil, but into his own flesh, with a Stanley knife, eliciting</w:t>
       </w:r>
     </w:p>
-    <w:p/>
-    <w:p>
-      <w:r>
-        <w:t xml:space="preserve">         “ a cry from some of myself.</w:t>
-      </w:r>
-    </w:p>
-    <w:p>
-      <w:r>
-        <w:t>So this is me. This</w:t>
-      </w:r>
-    </w:p>
-    <w:p>
-      <w:r>
-        <w:t>jameen. This meat</w:t>
-      </w:r>
-    </w:p>
-    <w:p>
-      <w:r>
-        <w:t>for which I war</w:t>
-      </w:r>
-    </w:p>
-    <w:p>
-      <w:r>
-        <w:t>myself.</w:t>
-      </w:r>
-    </w:p>
-    <w:p>
-      <w:r>
-        <w:t>This.”</w:t>
+    <w:p>
+      <w:r>
+        <w:t xml:space="preserve">&lt;quote&gt;</w:t>
+      </w:r>
+      <w:r>
+        <w:t xml:space="preserve">         a cry from some of myself.</w:t>
+      </w:r>
+      <w:r>
+        <w:br/>
+      </w:r>
+      <w:r>
+        <w:t xml:space="preserve">So this is me. This</w:t>
+      </w:r>
+      <w:r>
+        <w:br/>
+      </w:r>
+      <w:r>
+        <w:t xml:space="preserve">jameen. This meat</w:t>
+      </w:r>
+      <w:r>
+        <w:br/>
+      </w:r>
+      <w:r>
+        <w:t xml:space="preserve">for which I war</w:t>
+      </w:r>
+      <w:r>
+        <w:br/>
+      </w:r>
+      <w:r>
+        <w:t xml:space="preserve">myself.</w:t>
+      </w:r>
+      <w:r>
+        <w:br/>
+      </w:r>
+      <w:r>
+        <w:t xml:space="preserve">This.</w:t>
+      </w:r>
+      <w:r>
+        <w:t xml:space="preserve">&lt;/quote&gt;</w:t>
       </w:r>
     </w:p>
     <w:p/>

</xml_diff>